<commit_message>
Complete ASCO governance and compliance document set
</commit_message>
<xml_diff>
--- a/Governance Documents/ASCO Donation Acceptance Due Diligence and Gift Administration Procedure 2026.docx
+++ b/Governance Documents/ASCO Donation Acceptance Due Diligence and Gift Administration Procedure 2026.docx
@@ -1183,347 +1183,571 @@
     </w:p>
     <w:tbl>
       <w:tblPr>
-        <w:tblStyle w:val="TableGrid"/>
-        <w:tblW w:type="auto" w:w="0"/>
+        <w:tblW w:w="0" w:type="auto"/>
         <w:jc w:val="center"/>
-        <w:tblLook w:firstColumn="1" w:firstRow="1" w:lastColumn="0" w:lastRow="0" w:noHBand="0" w:noVBand="1" w:val="04A0"/>
+        <w:tblLayout w:type="fixed"/>
+        <w:tblLook w:val="04A0" w:firstRow="1" w:lastRow="0" w:firstColumn="1" w:lastColumn="0" w:noHBand="0" w:noVBand="1"/>
       </w:tblPr>
       <w:tblGrid>
-        <w:gridCol w:w="2256"/>
-        <w:gridCol w:w="2256"/>
-        <w:gridCol w:w="2256"/>
-        <w:gridCol w:w="2256"/>
+        <w:gridCol w:w="4968"/>
+        <w:gridCol w:w="4968"/>
       </w:tblGrid>
       <w:tr>
         <w:trPr>
-          <w:tblHeader w:val="true"/>
+          <w:cantSplit/>
+          <w:jc w:val="center"/>
         </w:trPr>
         <w:tc>
           <w:tcPr>
-            <w:tcW w:type="dxa" w:w="3600"/>
-            <w:shd w:fill="145A32"/>
+            <w:tcW w:w="4968" w:type="dxa"/>
+            <w:tcBorders>
+              <w:top w:val="single" w:sz="5" w:space="0" w:color="D8DDD8"/>
+              <w:left w:val="single" w:sz="5" w:space="0" w:color="D8DDD8"/>
+              <w:bottom w:val="single" w:sz="5" w:space="0" w:color="D8DDD8"/>
+              <w:right w:val="single" w:sz="5" w:space="0" w:color="D8DDD8"/>
+            </w:tcBorders>
+            <w:shd w:val="clear" w:color="auto" w:fill="F7F8F5"/>
           </w:tcPr>
           <w:p>
-            <w:r/>
+            <w:r>
+              <w:rPr>
+                <w:noProof/>
+              </w:rPr>
+              <w:drawing>
+                <wp:anchor distT="0" distB="0" distL="114300" distR="114300" simplePos="0" relativeHeight="251655680" behindDoc="0" locked="0" layoutInCell="1" allowOverlap="1" wp14:anchorId="6F62F57F" wp14:editId="7142108A">
+                  <wp:simplePos x="0" y="0"/>
+                  <wp:positionH relativeFrom="column">
+                    <wp:posOffset>257175</wp:posOffset>
+                  </wp:positionH>
+                  <wp:positionV relativeFrom="paragraph">
+                    <wp:posOffset>283845</wp:posOffset>
+                  </wp:positionV>
+                  <wp:extent cx="2152650" cy="485775"/>
+                  <wp:effectExtent l="0" t="0" r="0" b="0"/>
+                  <wp:wrapNone/>
+                  <wp:docPr id="1466813974" name="Picture 2"/>
+                  <wp:cNvGraphicFramePr>
+                    <a:graphicFrameLocks xmlns:a="http://schemas.openxmlformats.org/drawingml/2006/main" noChangeAspect="1"/>
+                  </wp:cNvGraphicFramePr>
+                  <a:graphic xmlns:a="http://schemas.openxmlformats.org/drawingml/2006/main">
+                    <a:graphicData uri="http://schemas.openxmlformats.org/drawingml/2006/picture">
+                      <pic:pic xmlns:pic="http://schemas.openxmlformats.org/drawingml/2006/picture">
+                        <pic:nvPicPr>
+                          <pic:cNvPr id="1466813974" name="Picture 1466813974"/>
+                          <pic:cNvPicPr/>
+                        </pic:nvPicPr>
+                        <pic:blipFill rotWithShape="1">
+                          <a:blip r:embed="rId8">
+                            <a:biLevel thresh="75000"/>
+                          </a:blip>
+                          <a:srcRect l="9786" t="42903" r="18875" b="40265"/>
+                          <a:stretch>
+                            <a:fillRect/>
+                          </a:stretch>
+                        </pic:blipFill>
+                        <pic:spPr bwMode="auto">
+                          <a:xfrm>
+                            <a:off x="0" y="0"/>
+                            <a:ext cx="2152650" cy="485775"/>
+                          </a:xfrm>
+                          <a:prstGeom prst="rect">
+                            <a:avLst/>
+                          </a:prstGeom>
+                          <a:ln>
+                            <a:noFill/>
+                          </a:ln>
+                          <a:extLst>
+                            <a:ext uri="{53640926-AAD7-44D8-BBD7-CCE9431645EC}">
+                              <a14:shadowObscured xmlns:a14="http://schemas.microsoft.com/office/drawing/2010/main"/>
+                            </a:ext>
+                          </a:extLst>
+                        </pic:spPr>
+                      </pic:pic>
+                    </a:graphicData>
+                  </a:graphic>
+                  <wp14:sizeRelH relativeFrom="margin">
+                    <wp14:pctWidth>0</wp14:pctWidth>
+                  </wp14:sizeRelH>
+                  <wp14:sizeRelV relativeFrom="margin">
+                    <wp14:pctHeight>0</wp14:pctHeight>
+                  </wp14:sizeRelV>
+                </wp:anchor>
+              </w:drawing>
+            </w:r>
+            <w:r>
+              <w:rPr>
+                <w:b/>
+                <w:color w:val="145A32"/>
+                <w:sz w:val="16"/>
+              </w:rPr>
+              <w:t>CHAIR</w:t>
+            </w:r>
+            <w:r>
+              <w:rPr>
+                <w:b/>
+                <w:color w:val="145A32"/>
+                <w:sz w:val="16"/>
+              </w:rPr>
+              <w:t xml:space="preserve"> </w:t>
+            </w:r>
+            <w:r>
+              <w:rPr>
+                <w:b/>
+                <w:color w:val="145A32"/>
+                <w:sz w:val="16"/>
+              </w:rPr>
+              <w:t>LADY</w:t>
+            </w:r>
             <w:r>
               <w:rPr>
                 <w:b/>
                 <w:sz w:val="18"/>
               </w:rPr>
-              <w:t>Role</w:t>
+              <w:br/>
+              <w:t>Ms. Busisiwe Makhosi Shandu</w:t>
+            </w:r>
+            <w:r>
+              <w:br/>
+              <w:t>Signature:</w:t>
+            </w:r>
+            <w:r>
+              <w:t xml:space="preserve"> </w:t>
+            </w:r>
+            <w:r>
+              <w:br/>
+              <w:t>____________________________</w:t>
+            </w:r>
+            <w:r>
+              <w:br/>
+              <w:t>Date:</w:t>
+            </w:r>
+            <w:r>
+              <w:t xml:space="preserve"> </w:t>
+            </w:r>
+            <w:r>
+              <w:rPr>
+                <w:b/>
+                <w:bCs/>
+              </w:rPr>
+              <w:t>6 September 2026</w:t>
+            </w:r>
+            <w:r>
+              <w:br/>
+              <w:t>____________________________</w:t>
             </w:r>
           </w:p>
         </w:tc>
         <w:tc>
           <w:tcPr>
-            <w:tcW w:type="dxa" w:w="2880"/>
-            <w:shd w:fill="145A32"/>
+            <w:tcW w:w="4968" w:type="dxa"/>
+            <w:tcBorders>
+              <w:top w:val="single" w:sz="5" w:space="0" w:color="D8DDD8"/>
+              <w:left w:val="single" w:sz="5" w:space="0" w:color="D8DDD8"/>
+              <w:bottom w:val="single" w:sz="5" w:space="0" w:color="D8DDD8"/>
+              <w:right w:val="single" w:sz="5" w:space="0" w:color="D8DDD8"/>
+            </w:tcBorders>
+            <w:shd w:val="clear" w:color="auto" w:fill="F7F8F5"/>
           </w:tcPr>
           <w:p>
-            <w:r/>
+            <w:pPr>
+              <w:rPr>
+                <w:noProof/>
+              </w:rPr>
+            </w:pPr>
+            <w:r>
+              <w:rPr>
+                <w:noProof/>
+              </w:rPr>
+              <w:drawing>
+                <wp:anchor distT="0" distB="0" distL="114300" distR="114300" simplePos="0" relativeHeight="251665920" behindDoc="0" locked="0" layoutInCell="1" allowOverlap="1" wp14:anchorId="6209203C" wp14:editId="748DA760">
+                  <wp:simplePos x="0" y="0"/>
+                  <wp:positionH relativeFrom="column">
+                    <wp:posOffset>236220</wp:posOffset>
+                  </wp:positionH>
+                  <wp:positionV relativeFrom="paragraph">
+                    <wp:posOffset>198120</wp:posOffset>
+                  </wp:positionV>
+                  <wp:extent cx="2472690" cy="561975"/>
+                  <wp:effectExtent l="0" t="0" r="0" b="0"/>
+                  <wp:wrapNone/>
+                  <wp:docPr id="1629349264" name="Picture 5"/>
+                  <wp:cNvGraphicFramePr>
+                    <a:graphicFrameLocks xmlns:a="http://schemas.openxmlformats.org/drawingml/2006/main" noChangeAspect="1"/>
+                  </wp:cNvGraphicFramePr>
+                  <a:graphic xmlns:a="http://schemas.openxmlformats.org/drawingml/2006/main">
+                    <a:graphicData uri="http://schemas.openxmlformats.org/drawingml/2006/picture">
+                      <pic:pic xmlns:pic="http://schemas.openxmlformats.org/drawingml/2006/picture">
+                        <pic:nvPicPr>
+                          <pic:cNvPr id="1629349264" name="Picture 1629349264"/>
+                          <pic:cNvPicPr/>
+                        </pic:nvPicPr>
+                        <pic:blipFill rotWithShape="1">
+                          <a:blip r:embed="rId9">
+                            <a:biLevel thresh="75000"/>
+                          </a:blip>
+                          <a:srcRect t="41080" b="41419"/>
+                          <a:stretch>
+                            <a:fillRect/>
+                          </a:stretch>
+                        </pic:blipFill>
+                        <pic:spPr bwMode="auto">
+                          <a:xfrm>
+                            <a:off x="0" y="0"/>
+                            <a:ext cx="2472690" cy="561975"/>
+                          </a:xfrm>
+                          <a:prstGeom prst="rect">
+                            <a:avLst/>
+                          </a:prstGeom>
+                          <a:ln>
+                            <a:noFill/>
+                          </a:ln>
+                          <a:extLst>
+                            <a:ext uri="{53640926-AAD7-44D8-BBD7-CCE9431645EC}">
+                              <a14:shadowObscured xmlns:a14="http://schemas.microsoft.com/office/drawing/2010/main"/>
+                            </a:ext>
+                          </a:extLst>
+                        </pic:spPr>
+                      </pic:pic>
+                    </a:graphicData>
+                  </a:graphic>
+                  <wp14:sizeRelH relativeFrom="page">
+                    <wp14:pctWidth>0</wp14:pctWidth>
+                  </wp14:sizeRelH>
+                  <wp14:sizeRelV relativeFrom="page">
+                    <wp14:pctHeight>0</wp14:pctHeight>
+                  </wp14:sizeRelV>
+                </wp:anchor>
+              </w:drawing>
+            </w:r>
+            <w:r>
+              <w:rPr>
+                <w:b/>
+                <w:color w:val="145A32"/>
+                <w:sz w:val="16"/>
+              </w:rPr>
+              <w:t>DIRECTOR: HEAD OF ICT AND COMMUNICATIONS</w:t>
+            </w:r>
             <w:r>
               <w:rPr>
                 <w:b/>
                 <w:sz w:val="18"/>
               </w:rPr>
-              <w:t>Name</w:t>
+              <w:br/>
+              <w:t xml:space="preserve">Mr. Thapelo </w:t>
+            </w:r>
+            <w:r>
+              <w:rPr>
+                <w:b/>
+                <w:sz w:val="18"/>
+              </w:rPr>
+              <w:t xml:space="preserve">Nelson </w:t>
+            </w:r>
+            <w:r>
+              <w:rPr>
+                <w:b/>
+                <w:sz w:val="18"/>
+              </w:rPr>
+              <w:t>Maqalika</w:t>
+            </w:r>
+            <w:r>
+              <w:br/>
+              <w:t>Signature:</w:t>
+            </w:r>
+            <w:r>
+              <w:t xml:space="preserve"> </w:t>
+            </w:r>
+            <w:r>
+              <w:br/>
+              <w:t>____________________________</w:t>
+            </w:r>
+            <w:r>
+              <w:br/>
+              <w:t>Date:</w:t>
+            </w:r>
+            <w:r>
+              <w:t xml:space="preserve"> </w:t>
+            </w:r>
+            <w:r>
+              <w:rPr>
+                <w:b/>
+                <w:bCs/>
+              </w:rPr>
+              <w:t>6 September 2026</w:t>
+            </w:r>
+            <w:r>
+              <w:br/>
+              <w:t>____________________________</w:t>
+            </w:r>
+          </w:p>
+        </w:tc>
+      </w:tr>
+      <w:tr>
+        <w:trPr>
+          <w:cantSplit/>
+          <w:jc w:val="center"/>
+        </w:trPr>
+        <w:tc>
+          <w:tcPr>
+            <w:tcW w:w="4968" w:type="dxa"/>
+            <w:tcBorders>
+              <w:top w:val="single" w:sz="5" w:space="0" w:color="D8DDD8"/>
+              <w:left w:val="single" w:sz="5" w:space="0" w:color="D8DDD8"/>
+              <w:bottom w:val="single" w:sz="5" w:space="0" w:color="D8DDD8"/>
+              <w:right w:val="single" w:sz="5" w:space="0" w:color="D8DDD8"/>
+            </w:tcBorders>
+            <w:shd w:val="clear" w:color="auto" w:fill="F7F8F5"/>
+          </w:tcPr>
+          <w:p>
+            <w:pPr>
+              <w:rPr>
+                <w:noProof/>
+              </w:rPr>
+            </w:pPr>
+            <w:r>
+              <w:rPr>
+                <w:noProof/>
+              </w:rPr>
+              <w:drawing>
+                <wp:anchor distT="0" distB="0" distL="114300" distR="114300" simplePos="0" relativeHeight="251664896" behindDoc="0" locked="0" layoutInCell="1" allowOverlap="1" wp14:anchorId="7C45599E" wp14:editId="53012904">
+                  <wp:simplePos x="0" y="0"/>
+                  <wp:positionH relativeFrom="column">
+                    <wp:posOffset>434341</wp:posOffset>
+                  </wp:positionH>
+                  <wp:positionV relativeFrom="paragraph">
+                    <wp:posOffset>163195</wp:posOffset>
+                  </wp:positionV>
+                  <wp:extent cx="1777009" cy="684328"/>
+                  <wp:effectExtent l="0" t="0" r="0" b="0"/>
+                  <wp:wrapNone/>
+                  <wp:docPr id="264294559" name="Picture 4"/>
+                  <wp:cNvGraphicFramePr>
+                    <a:graphicFrameLocks xmlns:a="http://schemas.openxmlformats.org/drawingml/2006/main" noChangeAspect="1"/>
+                  </wp:cNvGraphicFramePr>
+                  <a:graphic xmlns:a="http://schemas.openxmlformats.org/drawingml/2006/main">
+                    <a:graphicData uri="http://schemas.openxmlformats.org/drawingml/2006/picture">
+                      <pic:pic xmlns:pic="http://schemas.openxmlformats.org/drawingml/2006/picture">
+                        <pic:nvPicPr>
+                          <pic:cNvPr id="264294559" name="Picture 264294559"/>
+                          <pic:cNvPicPr/>
+                        </pic:nvPicPr>
+                        <pic:blipFill rotWithShape="1">
+                          <a:blip r:embed="rId10">
+                            <a:biLevel thresh="75000"/>
+                          </a:blip>
+                          <a:srcRect t="36616" b="24874"/>
+                          <a:stretch>
+                            <a:fillRect/>
+                          </a:stretch>
+                        </pic:blipFill>
+                        <pic:spPr bwMode="auto">
+                          <a:xfrm rot="462680">
+                            <a:off x="0" y="0"/>
+                            <a:ext cx="1777009" cy="684328"/>
+                          </a:xfrm>
+                          <a:prstGeom prst="rect">
+                            <a:avLst/>
+                          </a:prstGeom>
+                          <a:ln>
+                            <a:noFill/>
+                          </a:ln>
+                          <a:extLst>
+                            <a:ext uri="{53640926-AAD7-44D8-BBD7-CCE9431645EC}">
+                              <a14:shadowObscured xmlns:a14="http://schemas.microsoft.com/office/drawing/2010/main"/>
+                            </a:ext>
+                          </a:extLst>
+                        </pic:spPr>
+                      </pic:pic>
+                    </a:graphicData>
+                  </a:graphic>
+                  <wp14:sizeRelH relativeFrom="page">
+                    <wp14:pctWidth>0</wp14:pctWidth>
+                  </wp14:sizeRelH>
+                  <wp14:sizeRelV relativeFrom="page">
+                    <wp14:pctHeight>0</wp14:pctHeight>
+                  </wp14:sizeRelV>
+                </wp:anchor>
+              </w:drawing>
+            </w:r>
+            <w:r>
+              <w:rPr>
+                <w:b/>
+                <w:color w:val="145A32"/>
+                <w:sz w:val="16"/>
+              </w:rPr>
+              <w:t>EXECUTIVE DIRECTOR</w:t>
+            </w:r>
+            <w:r>
+              <w:rPr>
+                <w:b/>
+                <w:sz w:val="18"/>
+              </w:rPr>
+              <w:br/>
+              <w:t>Mr. Bhekisisa Shandu</w:t>
+            </w:r>
+            <w:r>
+              <w:br/>
+              <w:t>Signature:</w:t>
+            </w:r>
+            <w:r>
+              <w:t xml:space="preserve"> </w:t>
+            </w:r>
+            <w:r>
+              <w:br/>
+              <w:t>____________________________</w:t>
+            </w:r>
+            <w:r>
+              <w:br/>
+              <w:t>Date:</w:t>
+            </w:r>
+            <w:r>
+              <w:t xml:space="preserve"> </w:t>
+            </w:r>
+            <w:r>
+              <w:rPr>
+                <w:b/>
+                <w:bCs/>
+              </w:rPr>
+              <w:t>6 September 2026</w:t>
+            </w:r>
+            <w:r>
+              <w:br/>
+              <w:t>____________________________</w:t>
             </w:r>
           </w:p>
         </w:tc>
         <w:tc>
           <w:tcPr>
-            <w:tcW w:type="dxa" w:w="1872"/>
-            <w:shd w:fill="145A32"/>
+            <w:tcW w:w="4968" w:type="dxa"/>
+            <w:tcBorders>
+              <w:top w:val="single" w:sz="5" w:space="0" w:color="D8DDD8"/>
+              <w:left w:val="single" w:sz="5" w:space="0" w:color="D8DDD8"/>
+              <w:bottom w:val="single" w:sz="5" w:space="0" w:color="D8DDD8"/>
+              <w:right w:val="single" w:sz="5" w:space="0" w:color="D8DDD8"/>
+            </w:tcBorders>
+            <w:shd w:val="clear" w:color="auto" w:fill="F7F8F5"/>
           </w:tcPr>
           <w:p>
-            <w:r/>
+            <w:r>
+              <w:rPr>
+                <w:noProof/>
+                <w:sz w:val="16"/>
+                <w:szCs w:val="16"/>
+              </w:rPr>
+              <w:drawing>
+                <wp:anchor distT="0" distB="0" distL="114300" distR="114300" simplePos="0" relativeHeight="251662848" behindDoc="0" locked="0" layoutInCell="1" allowOverlap="1" wp14:anchorId="48E97359" wp14:editId="45959AF6">
+                  <wp:simplePos x="0" y="0"/>
+                  <wp:positionH relativeFrom="column">
+                    <wp:posOffset>393065</wp:posOffset>
+                  </wp:positionH>
+                  <wp:positionV relativeFrom="paragraph">
+                    <wp:posOffset>286514</wp:posOffset>
+                  </wp:positionV>
+                  <wp:extent cx="1354277" cy="892568"/>
+                  <wp:effectExtent l="0" t="0" r="0" b="0"/>
+                  <wp:wrapNone/>
+                  <wp:docPr id="70748101" name="Picture 3"/>
+                  <wp:cNvGraphicFramePr>
+                    <a:graphicFrameLocks xmlns:a="http://schemas.openxmlformats.org/drawingml/2006/main" noChangeAspect="1"/>
+                  </wp:cNvGraphicFramePr>
+                  <a:graphic xmlns:a="http://schemas.openxmlformats.org/drawingml/2006/main">
+                    <a:graphicData uri="http://schemas.openxmlformats.org/drawingml/2006/picture">
+                      <pic:pic xmlns:pic="http://schemas.openxmlformats.org/drawingml/2006/picture">
+                        <pic:nvPicPr>
+                          <pic:cNvPr id="70748101" name="Picture 70748101"/>
+                          <pic:cNvPicPr/>
+                        </pic:nvPicPr>
+                        <pic:blipFill rotWithShape="1">
+                          <a:blip r:embed="rId11">
+                            <a:biLevel thresh="75000"/>
+                          </a:blip>
+                          <a:srcRect t="20028" b="17298"/>
+                          <a:stretch>
+                            <a:fillRect/>
+                          </a:stretch>
+                        </pic:blipFill>
+                        <pic:spPr bwMode="auto">
+                          <a:xfrm rot="164574">
+                            <a:off x="0" y="0"/>
+                            <a:ext cx="1354277" cy="892568"/>
+                          </a:xfrm>
+                          <a:prstGeom prst="rect">
+                            <a:avLst/>
+                          </a:prstGeom>
+                          <a:ln>
+                            <a:noFill/>
+                          </a:ln>
+                          <a:extLst>
+                            <a:ext uri="{53640926-AAD7-44D8-BBD7-CCE9431645EC}">
+                              <a14:shadowObscured xmlns:a14="http://schemas.microsoft.com/office/drawing/2010/main"/>
+                            </a:ext>
+                          </a:extLst>
+                        </pic:spPr>
+                      </pic:pic>
+                    </a:graphicData>
+                  </a:graphic>
+                  <wp14:sizeRelH relativeFrom="margin">
+                    <wp14:pctWidth>0</wp14:pctWidth>
+                  </wp14:sizeRelH>
+                  <wp14:sizeRelV relativeFrom="margin">
+                    <wp14:pctHeight>0</wp14:pctHeight>
+                  </wp14:sizeRelV>
+                </wp:anchor>
+              </w:drawing>
+            </w:r>
+            <w:r>
+              <w:rPr>
+                <w:b/>
+                <w:color w:val="145A32"/>
+                <w:sz w:val="16"/>
+                <w:szCs w:val="16"/>
+              </w:rPr>
+              <w:t>DIRECTOR: PEOPLE AND CULTURE / CHAIRPERSON: FINANCE AND PROCUREMENT COMMITTEE</w:t>
+            </w:r>
+            <w:r>
+              <w:br/>
+            </w:r>
             <w:r>
               <w:rPr>
                 <w:b/>
                 <w:sz w:val="18"/>
               </w:rPr>
-              <w:t>Signature</w:t>
+              <w:t>Mr. Khulekani Gumede</w:t>
             </w:r>
-          </w:p>
-        </w:tc>
-        <w:tc>
-          <w:tcPr>
-            <w:tcW w:type="dxa" w:w="1440"/>
-            <w:shd w:fill="145A32"/>
-          </w:tcPr>
-          <w:p>
-            <w:r/>
+            <w:r>
+              <w:br/>
+              <w:t>Signature:</w:t>
+            </w:r>
+            <w:r>
+              <w:t xml:space="preserve"> </w:t>
+            </w:r>
+            <w:r>
+              <w:br/>
+              <w:t>____________________________</w:t>
+            </w:r>
+            <w:r>
+              <w:br/>
+            </w:r>
+            <w:r>
+              <w:t>Date:</w:t>
+            </w:r>
+            <w:r>
+              <w:t xml:space="preserve"> </w:t>
+            </w:r>
             <w:r>
               <w:rPr>
                 <w:b/>
-                <w:sz w:val="18"/>
+                <w:bCs/>
               </w:rPr>
-              <w:t>Date</w:t>
+              <w:t>6 September 2026</w:t>
             </w:r>
-          </w:p>
-        </w:tc>
-      </w:tr>
-      <w:tr>
-        <w:tc>
-          <w:tcPr>
-            <w:tcW w:type="dxa" w:w="3600"/>
-          </w:tcPr>
-          <w:p>
-            <w:r/>
             <w:r>
-              <w:rPr>
-                <w:b w:val="0"/>
-                <w:sz w:val="18"/>
-              </w:rPr>
-              <w:t>Chairperson / Founding Chairperson</w:t>
-            </w:r>
-          </w:p>
-        </w:tc>
-        <w:tc>
-          <w:tcPr>
-            <w:tcW w:type="dxa" w:w="2880"/>
-          </w:tcPr>
-          <w:p>
-            <w:r/>
-            <w:r>
-              <w:rPr>
-                <w:b w:val="0"/>
-                <w:sz w:val="18"/>
-              </w:rPr>
-              <w:t>Ms Busisiwe Makhosi Shandu</w:t>
-            </w:r>
-          </w:p>
-        </w:tc>
-        <w:tc>
-          <w:tcPr>
-            <w:tcW w:type="dxa" w:w="1872"/>
-          </w:tcPr>
-          <w:p>
-            <w:r/>
-            <w:r>
-              <w:rPr>
-                <w:b w:val="0"/>
-                <w:sz w:val="18"/>
-              </w:rPr>
-              <w:t>____________________</w:t>
-            </w:r>
-          </w:p>
-        </w:tc>
-        <w:tc>
-          <w:tcPr>
-            <w:tcW w:type="dxa" w:w="1440"/>
-          </w:tcPr>
-          <w:p>
-            <w:r/>
-            <w:r>
-              <w:rPr>
-                <w:b w:val="0"/>
-                <w:sz w:val="18"/>
-              </w:rPr>
-              <w:t>________________</w:t>
-            </w:r>
-          </w:p>
-        </w:tc>
-      </w:tr>
-      <w:tr>
-        <w:tc>
-          <w:tcPr>
-            <w:tcW w:type="dxa" w:w="3600"/>
-          </w:tcPr>
-          <w:p>
-            <w:r/>
-            <w:r>
-              <w:rPr>
-                <w:b w:val="0"/>
-                <w:sz w:val="18"/>
-              </w:rPr>
-              <w:t>Executive Director</w:t>
-            </w:r>
-          </w:p>
-        </w:tc>
-        <w:tc>
-          <w:tcPr>
-            <w:tcW w:type="dxa" w:w="2880"/>
-          </w:tcPr>
-          <w:p>
-            <w:r/>
-            <w:r>
-              <w:rPr>
-                <w:b w:val="0"/>
-                <w:sz w:val="18"/>
-              </w:rPr>
-              <w:t>Mr Bhekisisa Shandu</w:t>
-            </w:r>
-          </w:p>
-        </w:tc>
-        <w:tc>
-          <w:tcPr>
-            <w:tcW w:type="dxa" w:w="1872"/>
-          </w:tcPr>
-          <w:p>
-            <w:r/>
-            <w:r>
-              <w:rPr>
-                <w:b w:val="0"/>
-                <w:sz w:val="18"/>
-              </w:rPr>
-              <w:t>____________________</w:t>
-            </w:r>
-          </w:p>
-        </w:tc>
-        <w:tc>
-          <w:tcPr>
-            <w:tcW w:type="dxa" w:w="1440"/>
-          </w:tcPr>
-          <w:p>
-            <w:r/>
-            <w:r>
-              <w:rPr>
-                <w:b w:val="0"/>
-                <w:sz w:val="18"/>
-              </w:rPr>
-              <w:t>________________</w:t>
-            </w:r>
-          </w:p>
-        </w:tc>
-      </w:tr>
-      <w:tr>
-        <w:tc>
-          <w:tcPr>
-            <w:tcW w:type="dxa" w:w="3600"/>
-          </w:tcPr>
-          <w:p>
-            <w:r/>
-            <w:r>
-              <w:rPr>
-                <w:b w:val="0"/>
-                <w:sz w:val="18"/>
-              </w:rPr>
-              <w:t>Director: ICT and Communications</w:t>
-            </w:r>
-          </w:p>
-        </w:tc>
-        <w:tc>
-          <w:tcPr>
-            <w:tcW w:type="dxa" w:w="2880"/>
-          </w:tcPr>
-          <w:p>
-            <w:r/>
-            <w:r>
-              <w:rPr>
-                <w:b w:val="0"/>
-                <w:sz w:val="18"/>
-              </w:rPr>
-              <w:t>Mr Thapelo Nelson Maqalika</w:t>
-            </w:r>
-          </w:p>
-        </w:tc>
-        <w:tc>
-          <w:tcPr>
-            <w:tcW w:type="dxa" w:w="1872"/>
-          </w:tcPr>
-          <w:p>
-            <w:r/>
-            <w:r>
-              <w:rPr>
-                <w:b w:val="0"/>
-                <w:sz w:val="18"/>
-              </w:rPr>
-              <w:t>____________________</w:t>
-            </w:r>
-          </w:p>
-        </w:tc>
-        <w:tc>
-          <w:tcPr>
-            <w:tcW w:type="dxa" w:w="1440"/>
-          </w:tcPr>
-          <w:p>
-            <w:r/>
-            <w:r>
-              <w:rPr>
-                <w:b w:val="0"/>
-                <w:sz w:val="18"/>
-              </w:rPr>
-              <w:t>________________</w:t>
-            </w:r>
-          </w:p>
-        </w:tc>
-      </w:tr>
-      <w:tr>
-        <w:tc>
-          <w:tcPr>
-            <w:tcW w:type="dxa" w:w="3600"/>
-          </w:tcPr>
-          <w:p>
-            <w:r/>
-            <w:r>
-              <w:rPr>
-                <w:b w:val="0"/>
-                <w:sz w:val="18"/>
-              </w:rPr>
-              <w:t>Director: People and Culture / Chairperson: Finance and Procurement Committee</w:t>
-            </w:r>
-          </w:p>
-        </w:tc>
-        <w:tc>
-          <w:tcPr>
-            <w:tcW w:type="dxa" w:w="2880"/>
-          </w:tcPr>
-          <w:p>
-            <w:r/>
-            <w:r>
-              <w:rPr>
-                <w:b w:val="0"/>
-                <w:sz w:val="18"/>
-              </w:rPr>
-              <w:t>Mr Khulekani Gumede</w:t>
-            </w:r>
-          </w:p>
-        </w:tc>
-        <w:tc>
-          <w:tcPr>
-            <w:tcW w:type="dxa" w:w="1872"/>
-          </w:tcPr>
-          <w:p>
-            <w:r/>
-            <w:r>
-              <w:rPr>
-                <w:b w:val="0"/>
-                <w:sz w:val="18"/>
-              </w:rPr>
-              <w:t>____________________</w:t>
-            </w:r>
-          </w:p>
-        </w:tc>
-        <w:tc>
-          <w:tcPr>
-            <w:tcW w:type="dxa" w:w="1440"/>
-          </w:tcPr>
-          <w:p>
-            <w:r/>
-            <w:r>
-              <w:rPr>
-                <w:b w:val="0"/>
-                <w:sz w:val="18"/>
-              </w:rPr>
-              <w:t>________________</w:t>
+              <w:br/>
+              <w:t>____________________________</w:t>
             </w:r>
           </w:p>
         </w:tc>
       </w:tr>
     </w:tbl>
-    <w:p>
-      <w:pPr>
-        <w:spacing w:after="120" w:line="276" w:lineRule="auto"/>
-      </w:pPr>
-      <w:r>
-        <w:rPr>
-          <w:b w:val="0"/>
-          <w:sz w:val="21"/>
-        </w:rPr>
-        <w:t>Founder oversight note: The Founding Chairperson does not sign, approve or control ASCO financial documents or transactions.</w:t>
-      </w:r>
-    </w:p>
     <w:sectPr>
       <w:headerReference w:type="default" r:id="rId12"/>
       <w:footerReference w:type="default" r:id="rId13"/>
@@ -1617,7 +1841,7 @@
         <w:color w:val="145A32"/>
         <w:sz w:val="16"/>
       </w:rPr>
-      <w:t>DONATIONS AND REFUNDS POLICY</w:t>
+      <w:t/>
     </w:r>
   </w:p>
 </w:ftr>

</xml_diff>